<commit_message>
EDIT : File FIX-PROPOSAL-PAULINUS WENEHENUBUN_20210090.docx << Revisi BAB II add Flowchat Algoritma LINEAR SEARCH
</commit_message>
<xml_diff>
--- a/My Proposal Skripsi/FIX-PROPOSAL-PAULINUS WENEHENUBUN_20210090.docx
+++ b/My Proposal Skripsi/FIX-PROPOSAL-PAULINUS WENEHENUBUN_20210090.docx
@@ -521,6 +521,12 @@
           <w:szCs w:val="24"/>
         </w:rPr>
         <w:sectPr>
+          <w:headerReference w:type="even" r:id="rId9"/>
+          <w:headerReference w:type="default" r:id="rId10"/>
+          <w:footerReference w:type="even" r:id="rId11"/>
+          <w:footerReference w:type="default" r:id="rId12"/>
+          <w:headerReference w:type="first" r:id="rId13"/>
+          <w:footerReference w:type="first" r:id="rId14"/>
           <w:pgSz w:w="11907" w:h="16840" w:code="9"/>
           <w:pgMar w:top="1701" w:right="1701" w:bottom="1701" w:left="2268" w:header="714" w:footer="0" w:gutter="0"/>
           <w:cols w:space="708"/>
@@ -4344,8 +4350,8 @@
       <w:pPr>
         <w:spacing w:line="360" w:lineRule="auto"/>
         <w:sectPr>
-          <w:footerReference w:type="default" r:id="rId9"/>
-          <w:footerReference w:type="first" r:id="rId10"/>
+          <w:footerReference w:type="default" r:id="rId15"/>
+          <w:footerReference w:type="first" r:id="rId16"/>
           <w:pgSz w:w="11907" w:h="16840" w:code="9"/>
           <w:pgMar w:top="1701" w:right="1701" w:bottom="1701" w:left="2268" w:header="714" w:footer="0" w:gutter="0"/>
           <w:pgNumType w:fmt="lowerRoman" w:start="1"/>
@@ -15883,6 +15889,8 @@
         <w:rPr>
           <w:rFonts w:ascii="Times New Roman" w:hAnsi="Times New Roman" w:cs="Times New Roman"/>
           <w:bCs/>
+          <w:i/>
+          <w:iCs/>
           <w:sz w:val="24"/>
           <w:szCs w:val="24"/>
           <w:lang w:val="id"/>
@@ -15969,6 +15977,16 @@
           <w:lang w:val="id"/>
         </w:rPr>
         <w:t>.</w:t>
+      </w:r>
+      <w:r>
+        <w:rPr>
+          <w:rFonts w:ascii="Times New Roman" w:hAnsi="Times New Roman" w:cs="Times New Roman"/>
+          <w:bCs/>
+          <w:sz w:val="24"/>
+          <w:szCs w:val="24"/>
+          <w:lang w:val="id"/>
+        </w:rPr>
+        <w:t xml:space="preserve"> </w:t>
       </w:r>
     </w:p>
     <w:p>
@@ -15983,6 +16001,7 @@
           <w:iCs/>
           <w:sz w:val="24"/>
           <w:szCs w:val="24"/>
+          <w:lang w:val="id"/>
         </w:rPr>
       </w:pPr>
       <w:r>
@@ -16085,6 +16104,714 @@
           <w:lang w:val="id"/>
         </w:rPr>
         <w:t>.</w:t>
+      </w:r>
+      <w:r>
+        <w:rPr>
+          <w:rFonts w:ascii="Times New Roman" w:hAnsi="Times New Roman" w:cs="Times New Roman"/>
+          <w:bCs/>
+          <w:iCs/>
+          <w:sz w:val="24"/>
+          <w:szCs w:val="24"/>
+          <w:lang w:val="id"/>
+        </w:rPr>
+        <w:br/>
+      </w:r>
+      <w:r>
+        <w:rPr>
+          <w:rFonts w:ascii="Times New Roman" w:hAnsi="Times New Roman" w:cs="Times New Roman"/>
+          <w:bCs/>
+          <w:sz w:val="24"/>
+          <w:szCs w:val="24"/>
+          <w:lang w:val="id"/>
+        </w:rPr>
+        <w:br/>
+      </w:r>
+      <w:r>
+        <w:rPr>
+          <w:rFonts w:ascii="Times New Roman" w:hAnsi="Times New Roman" w:cs="Times New Roman"/>
+          <w:bCs/>
+          <w:sz w:val="24"/>
+          <w:szCs w:val="24"/>
+          <w:lang w:val="id"/>
+        </w:rPr>
+        <w:br/>
+      </w:r>
+      <w:r>
+        <w:rPr>
+          <w:rFonts w:ascii="Times New Roman" w:hAnsi="Times New Roman" w:cs="Times New Roman"/>
+          <w:bCs/>
+          <w:sz w:val="24"/>
+          <w:szCs w:val="24"/>
+          <w:lang w:val="id"/>
+        </w:rPr>
+        <w:br/>
+      </w:r>
+      <w:r>
+        <w:rPr>
+          <w:rFonts w:ascii="Times New Roman" w:hAnsi="Times New Roman" w:cs="Times New Roman"/>
+          <w:bCs/>
+          <w:sz w:val="24"/>
+          <w:szCs w:val="24"/>
+          <w:lang w:val="id"/>
+        </w:rPr>
+        <w:br/>
+      </w:r>
+      <w:r>
+        <w:rPr>
+          <w:rFonts w:ascii="Times New Roman" w:hAnsi="Times New Roman" w:cs="Times New Roman"/>
+          <w:bCs/>
+          <w:sz w:val="24"/>
+          <w:szCs w:val="24"/>
+          <w:lang w:val="id"/>
+        </w:rPr>
+        <w:br/>
+      </w:r>
+      <w:r>
+        <w:rPr>
+          <w:rFonts w:ascii="Times New Roman" w:hAnsi="Times New Roman" w:cs="Times New Roman"/>
+          <w:bCs/>
+          <w:sz w:val="24"/>
+          <w:szCs w:val="24"/>
+          <w:lang w:val="id"/>
+        </w:rPr>
+        <w:br/>
+      </w:r>
+      <w:r>
+        <w:rPr>
+          <w:rFonts w:ascii="Times New Roman" w:hAnsi="Times New Roman" w:cs="Times New Roman"/>
+          <w:bCs/>
+          <w:sz w:val="24"/>
+          <w:szCs w:val="24"/>
+          <w:lang w:val="id"/>
+        </w:rPr>
+        <w:br/>
+      </w:r>
+      <w:r>
+        <w:rPr>
+          <w:rFonts w:ascii="Times New Roman" w:hAnsi="Times New Roman" w:cs="Times New Roman"/>
+          <w:bCs/>
+          <w:sz w:val="24"/>
+          <w:szCs w:val="24"/>
+          <w:lang w:val="id"/>
+        </w:rPr>
+        <w:br/>
+      </w:r>
+      <w:r>
+        <w:rPr>
+          <w:rFonts w:ascii="Times New Roman" w:hAnsi="Times New Roman" w:cs="Times New Roman"/>
+          <w:bCs/>
+          <w:sz w:val="24"/>
+          <w:szCs w:val="24"/>
+          <w:lang w:val="id"/>
+        </w:rPr>
+        <w:br/>
+      </w:r>
+      <w:r>
+        <w:rPr>
+          <w:rFonts w:ascii="Times New Roman" w:hAnsi="Times New Roman" w:cs="Times New Roman"/>
+          <w:bCs/>
+          <w:sz w:val="24"/>
+          <w:szCs w:val="24"/>
+          <w:lang w:val="id"/>
+        </w:rPr>
+        <w:br/>
+      </w:r>
+    </w:p>
+    <w:p>
+      <w:pPr>
+        <w:keepNext/>
+        <w:spacing w:after="0" w:line="360" w:lineRule="auto"/>
+        <w:jc w:val="center"/>
+      </w:pPr>
+      <w:r>
+        <w:rPr>
+          <w:noProof/>
+        </w:rPr>
+        <w:lastRenderedPageBreak/>
+        <w:drawing>
+          <wp:inline distT="0" distB="0" distL="0" distR="0" wp14:anchorId="0D579124" wp14:editId="4277B122">
+            <wp:extent cx="2363638" cy="4127922"/>
+            <wp:effectExtent l="0" t="0" r="0" b="6350"/>
+            <wp:docPr id="388900125" name="Picture 4"/>
+            <wp:cNvGraphicFramePr>
+              <a:graphicFrameLocks xmlns:a="http://schemas.openxmlformats.org/drawingml/2006/main" noChangeAspect="1"/>
+            </wp:cNvGraphicFramePr>
+            <a:graphic xmlns:a="http://schemas.openxmlformats.org/drawingml/2006/main">
+              <a:graphicData uri="http://schemas.openxmlformats.org/drawingml/2006/picture">
+                <pic:pic xmlns:pic="http://schemas.openxmlformats.org/drawingml/2006/picture">
+                  <pic:nvPicPr>
+                    <pic:cNvPr id="0" name="Picture 5"/>
+                    <pic:cNvPicPr>
+                      <a:picLocks noChangeAspect="1" noChangeArrowheads="1"/>
+                    </pic:cNvPicPr>
+                  </pic:nvPicPr>
+                  <pic:blipFill>
+                    <a:blip r:embed="rId17">
+                      <a:extLst>
+                        <a:ext uri="{28A0092B-C50C-407E-A947-70E740481C1C}">
+                          <a14:useLocalDpi xmlns:a14="http://schemas.microsoft.com/office/drawing/2010/main" val="0"/>
+                        </a:ext>
+                      </a:extLst>
+                    </a:blip>
+                    <a:srcRect/>
+                    <a:stretch>
+                      <a:fillRect/>
+                    </a:stretch>
+                  </pic:blipFill>
+                  <pic:spPr bwMode="auto">
+                    <a:xfrm>
+                      <a:off x="0" y="0"/>
+                      <a:ext cx="2384510" cy="4164374"/>
+                    </a:xfrm>
+                    <a:prstGeom prst="rect">
+                      <a:avLst/>
+                    </a:prstGeom>
+                    <a:noFill/>
+                    <a:ln>
+                      <a:noFill/>
+                    </a:ln>
+                  </pic:spPr>
+                </pic:pic>
+              </a:graphicData>
+            </a:graphic>
+          </wp:inline>
+        </w:drawing>
+      </w:r>
+    </w:p>
+    <w:p>
+      <w:pPr>
+        <w:pStyle w:val="Caption"/>
+        <w:jc w:val="center"/>
+        <w:rPr>
+          <w:rFonts w:ascii="Times New Roman" w:hAnsi="Times New Roman" w:cs="Times New Roman"/>
+          <w:i w:val="0"/>
+          <w:iCs w:val="0"/>
+          <w:color w:val="auto"/>
+          <w:sz w:val="24"/>
+          <w:szCs w:val="24"/>
+        </w:rPr>
+      </w:pPr>
+      <w:r>
+        <w:rPr>
+          <w:rFonts w:ascii="Times New Roman" w:hAnsi="Times New Roman" w:cs="Times New Roman"/>
+          <w:i w:val="0"/>
+          <w:iCs w:val="0"/>
+          <w:color w:val="auto"/>
+          <w:sz w:val="24"/>
+          <w:szCs w:val="24"/>
+        </w:rPr>
+        <w:t xml:space="preserve">Gambar 2. </w:t>
+      </w:r>
+      <w:r>
+        <w:rPr>
+          <w:rFonts w:ascii="Times New Roman" w:hAnsi="Times New Roman" w:cs="Times New Roman"/>
+          <w:i w:val="0"/>
+          <w:iCs w:val="0"/>
+          <w:color w:val="auto"/>
+          <w:sz w:val="24"/>
+          <w:szCs w:val="24"/>
+        </w:rPr>
+        <w:fldChar w:fldCharType="begin"/>
+      </w:r>
+      <w:r>
+        <w:rPr>
+          <w:rFonts w:ascii="Times New Roman" w:hAnsi="Times New Roman" w:cs="Times New Roman"/>
+          <w:i w:val="0"/>
+          <w:iCs w:val="0"/>
+          <w:color w:val="auto"/>
+          <w:sz w:val="24"/>
+          <w:szCs w:val="24"/>
+        </w:rPr>
+        <w:instrText xml:space="preserve"> SEQ Gambar_2. \* ARABIC </w:instrText>
+      </w:r>
+      <w:r>
+        <w:rPr>
+          <w:rFonts w:ascii="Times New Roman" w:hAnsi="Times New Roman" w:cs="Times New Roman"/>
+          <w:i w:val="0"/>
+          <w:iCs w:val="0"/>
+          <w:color w:val="auto"/>
+          <w:sz w:val="24"/>
+          <w:szCs w:val="24"/>
+        </w:rPr>
+        <w:fldChar w:fldCharType="separate"/>
+      </w:r>
+      <w:r>
+        <w:rPr>
+          <w:rFonts w:ascii="Times New Roman" w:hAnsi="Times New Roman" w:cs="Times New Roman"/>
+          <w:i w:val="0"/>
+          <w:iCs w:val="0"/>
+          <w:noProof/>
+          <w:color w:val="auto"/>
+          <w:sz w:val="24"/>
+          <w:szCs w:val="24"/>
+        </w:rPr>
+        <w:t>1</w:t>
+      </w:r>
+      <w:r>
+        <w:rPr>
+          <w:rFonts w:ascii="Times New Roman" w:hAnsi="Times New Roman" w:cs="Times New Roman"/>
+          <w:i w:val="0"/>
+          <w:iCs w:val="0"/>
+          <w:color w:val="auto"/>
+          <w:sz w:val="24"/>
+          <w:szCs w:val="24"/>
+        </w:rPr>
+        <w:fldChar w:fldCharType="end"/>
+      </w:r>
+      <w:r>
+        <w:rPr>
+          <w:rFonts w:ascii="Times New Roman" w:hAnsi="Times New Roman" w:cs="Times New Roman"/>
+          <w:i w:val="0"/>
+          <w:iCs w:val="0"/>
+          <w:color w:val="auto"/>
+          <w:sz w:val="24"/>
+          <w:szCs w:val="24"/>
+        </w:rPr>
+        <w:t xml:space="preserve"> </w:t>
+      </w:r>
+      <w:r>
+        <w:rPr>
+          <w:rFonts w:ascii="Times New Roman" w:hAnsi="Times New Roman" w:cs="Times New Roman"/>
+          <w:color w:val="auto"/>
+          <w:sz w:val="24"/>
+          <w:szCs w:val="24"/>
+        </w:rPr>
+        <w:t>Flowchart</w:t>
+      </w:r>
+      <w:r>
+        <w:rPr>
+          <w:rFonts w:ascii="Times New Roman" w:hAnsi="Times New Roman" w:cs="Times New Roman"/>
+          <w:i w:val="0"/>
+          <w:iCs w:val="0"/>
+          <w:color w:val="auto"/>
+          <w:sz w:val="24"/>
+          <w:szCs w:val="24"/>
+        </w:rPr>
+        <w:t xml:space="preserve"> </w:t>
+      </w:r>
+      <w:proofErr w:type="spellStart"/>
+      <w:r>
+        <w:rPr>
+          <w:rFonts w:ascii="Times New Roman" w:hAnsi="Times New Roman" w:cs="Times New Roman"/>
+          <w:i w:val="0"/>
+          <w:iCs w:val="0"/>
+          <w:color w:val="auto"/>
+          <w:sz w:val="24"/>
+          <w:szCs w:val="24"/>
+        </w:rPr>
+        <w:t>Algoritma</w:t>
+      </w:r>
+      <w:proofErr w:type="spellEnd"/>
+      <w:r>
+        <w:rPr>
+          <w:rFonts w:ascii="Times New Roman" w:hAnsi="Times New Roman" w:cs="Times New Roman"/>
+          <w:i w:val="0"/>
+          <w:iCs w:val="0"/>
+          <w:color w:val="auto"/>
+          <w:sz w:val="24"/>
+          <w:szCs w:val="24"/>
+        </w:rPr>
+        <w:t xml:space="preserve"> </w:t>
+      </w:r>
+      <w:r>
+        <w:rPr>
+          <w:rFonts w:ascii="Times New Roman" w:hAnsi="Times New Roman" w:cs="Times New Roman"/>
+          <w:color w:val="auto"/>
+          <w:sz w:val="24"/>
+          <w:szCs w:val="24"/>
+        </w:rPr>
+        <w:t>Linear</w:t>
+      </w:r>
+      <w:r>
+        <w:rPr>
+          <w:rFonts w:ascii="Times New Roman" w:hAnsi="Times New Roman" w:cs="Times New Roman"/>
+          <w:color w:val="auto"/>
+          <w:sz w:val="24"/>
+          <w:szCs w:val="24"/>
+        </w:rPr>
+        <w:t xml:space="preserve"> </w:t>
+      </w:r>
+      <w:r>
+        <w:rPr>
+          <w:rFonts w:ascii="Times New Roman" w:hAnsi="Times New Roman" w:cs="Times New Roman"/>
+          <w:color w:val="auto"/>
+          <w:sz w:val="24"/>
+          <w:szCs w:val="24"/>
+        </w:rPr>
+        <w:t>Search</w:t>
+      </w:r>
+    </w:p>
+    <w:p>
+      <w:pPr>
+        <w:ind w:left="720" w:firstLine="720"/>
+        <w:rPr>
+          <w:rFonts w:ascii="Times New Roman" w:hAnsi="Times New Roman" w:cs="Times New Roman"/>
+          <w:sz w:val="24"/>
+          <w:szCs w:val="24"/>
+          <w:lang w:val="id"/>
+        </w:rPr>
+      </w:pPr>
+      <w:r>
+        <w:rPr>
+          <w:rFonts w:ascii="Times New Roman" w:hAnsi="Times New Roman" w:cs="Times New Roman"/>
+          <w:sz w:val="24"/>
+          <w:szCs w:val="24"/>
+          <w:lang w:val="id"/>
+        </w:rPr>
+        <w:t xml:space="preserve">Berikut penjelasan dari Gambar 2.1 </w:t>
+      </w:r>
+      <w:r>
+        <w:rPr>
+          <w:rFonts w:ascii="Times New Roman" w:hAnsi="Times New Roman" w:cs="Times New Roman"/>
+          <w:i/>
+          <w:iCs/>
+          <w:sz w:val="24"/>
+          <w:szCs w:val="24"/>
+          <w:lang w:val="id"/>
+        </w:rPr>
+        <w:t>Flowchart</w:t>
+      </w:r>
+      <w:r>
+        <w:rPr>
+          <w:rFonts w:ascii="Times New Roman" w:hAnsi="Times New Roman" w:cs="Times New Roman"/>
+          <w:sz w:val="24"/>
+          <w:szCs w:val="24"/>
+          <w:lang w:val="id"/>
+        </w:rPr>
+        <w:t xml:space="preserve"> Algoritma </w:t>
+      </w:r>
+      <w:r>
+        <w:rPr>
+          <w:rFonts w:ascii="Times New Roman" w:hAnsi="Times New Roman" w:cs="Times New Roman"/>
+          <w:i/>
+          <w:iCs/>
+          <w:sz w:val="24"/>
+          <w:szCs w:val="24"/>
+          <w:lang w:val="id"/>
+        </w:rPr>
+        <w:t xml:space="preserve">Linear </w:t>
+      </w:r>
+      <w:r>
+        <w:rPr>
+          <w:i/>
+          <w:iCs/>
+          <w:lang w:val="id"/>
+        </w:rPr>
+        <w:t xml:space="preserve"> </w:t>
+      </w:r>
+      <w:r>
+        <w:rPr>
+          <w:rFonts w:ascii="Times New Roman" w:hAnsi="Times New Roman" w:cs="Times New Roman"/>
+          <w:i/>
+          <w:iCs/>
+          <w:sz w:val="24"/>
+          <w:szCs w:val="24"/>
+          <w:lang w:val="id"/>
+        </w:rPr>
+        <w:t>Search</w:t>
+      </w:r>
+      <w:r>
+        <w:rPr>
+          <w:rFonts w:ascii="Times New Roman" w:hAnsi="Times New Roman" w:cs="Times New Roman"/>
+          <w:i/>
+          <w:iCs/>
+          <w:sz w:val="24"/>
+          <w:szCs w:val="24"/>
+          <w:lang w:val="id"/>
+        </w:rPr>
+        <w:t xml:space="preserve"> </w:t>
+      </w:r>
+      <w:r>
+        <w:rPr>
+          <w:rFonts w:ascii="Times New Roman" w:hAnsi="Times New Roman" w:cs="Times New Roman"/>
+          <w:sz w:val="24"/>
+          <w:szCs w:val="24"/>
+          <w:lang w:val="id"/>
+        </w:rPr>
+        <w:t>diatas:</w:t>
+      </w:r>
+    </w:p>
+    <w:p>
+      <w:pPr>
+        <w:pStyle w:val="ListParagraph"/>
+        <w:numPr>
+          <w:ilvl w:val="0"/>
+          <w:numId w:val="20"/>
+        </w:numPr>
+        <w:jc w:val="both"/>
+        <w:rPr>
+          <w:rFonts w:ascii="Times New Roman" w:hAnsi="Times New Roman" w:cs="Times New Roman"/>
+          <w:sz w:val="24"/>
+          <w:szCs w:val="24"/>
+          <w:lang w:val="id"/>
+        </w:rPr>
+      </w:pPr>
+      <w:r>
+        <w:rPr>
+          <w:rFonts w:ascii="Times New Roman" w:hAnsi="Times New Roman" w:cs="Times New Roman"/>
+          <w:i/>
+          <w:iCs/>
+          <w:sz w:val="24"/>
+          <w:szCs w:val="24"/>
+          <w:lang w:val="id"/>
+        </w:rPr>
+        <w:t>Input</w:t>
+      </w:r>
+      <w:r>
+        <w:rPr>
+          <w:rFonts w:ascii="Times New Roman" w:hAnsi="Times New Roman" w:cs="Times New Roman"/>
+          <w:sz w:val="24"/>
+          <w:szCs w:val="24"/>
+          <w:lang w:val="id"/>
+        </w:rPr>
+        <w:t xml:space="preserve"> </w:t>
+      </w:r>
+      <w:r>
+        <w:rPr>
+          <w:rFonts w:ascii="Times New Roman" w:hAnsi="Times New Roman" w:cs="Times New Roman"/>
+          <w:i/>
+          <w:iCs/>
+          <w:sz w:val="24"/>
+          <w:szCs w:val="24"/>
+          <w:lang w:val="id"/>
+        </w:rPr>
+        <w:t>keyword</w:t>
+      </w:r>
+      <w:r>
+        <w:rPr>
+          <w:rFonts w:ascii="Times New Roman" w:hAnsi="Times New Roman" w:cs="Times New Roman"/>
+          <w:sz w:val="24"/>
+          <w:szCs w:val="24"/>
+          <w:lang w:val="id"/>
+        </w:rPr>
+        <w:t xml:space="preserve"> </w:t>
+      </w:r>
+      <w:r>
+        <w:rPr>
+          <w:rFonts w:ascii="Times New Roman" w:hAnsi="Times New Roman" w:cs="Times New Roman"/>
+          <w:sz w:val="24"/>
+          <w:szCs w:val="24"/>
+          <w:lang w:val="id"/>
+        </w:rPr>
+        <w:t>i,</w:t>
+      </w:r>
+    </w:p>
+    <w:p>
+      <w:pPr>
+        <w:pStyle w:val="ListParagraph"/>
+        <w:numPr>
+          <w:ilvl w:val="0"/>
+          <w:numId w:val="20"/>
+        </w:numPr>
+        <w:jc w:val="both"/>
+        <w:rPr>
+          <w:rFonts w:ascii="Times New Roman" w:hAnsi="Times New Roman" w:cs="Times New Roman"/>
+          <w:sz w:val="24"/>
+          <w:szCs w:val="24"/>
+          <w:lang w:val="id"/>
+        </w:rPr>
+      </w:pPr>
+      <w:r>
+        <w:rPr>
+          <w:rFonts w:ascii="Times New Roman" w:hAnsi="Times New Roman" w:cs="Times New Roman"/>
+          <w:sz w:val="24"/>
+          <w:szCs w:val="24"/>
+          <w:lang w:val="id"/>
+        </w:rPr>
+        <w:t xml:space="preserve">Apakah i &lt; panjang array? Jika </w:t>
+      </w:r>
+      <w:r>
+        <w:rPr>
+          <w:rFonts w:ascii="Times New Roman" w:hAnsi="Times New Roman" w:cs="Times New Roman"/>
+          <w:i/>
+          <w:iCs/>
+          <w:sz w:val="24"/>
+          <w:szCs w:val="24"/>
+          <w:lang w:val="id"/>
+        </w:rPr>
+        <w:t>false</w:t>
+      </w:r>
+      <w:r>
+        <w:rPr>
+          <w:rFonts w:ascii="Times New Roman" w:hAnsi="Times New Roman" w:cs="Times New Roman"/>
+          <w:sz w:val="24"/>
+          <w:szCs w:val="24"/>
+          <w:lang w:val="id"/>
+        </w:rPr>
+        <w:t xml:space="preserve"> maka elemen tidak</w:t>
+      </w:r>
+      <w:r>
+        <w:rPr>
+          <w:rFonts w:ascii="Times New Roman" w:hAnsi="Times New Roman" w:cs="Times New Roman"/>
+          <w:sz w:val="24"/>
+          <w:szCs w:val="24"/>
+          <w:lang w:val="id"/>
+        </w:rPr>
+        <w:t xml:space="preserve"> </w:t>
+      </w:r>
+      <w:r>
+        <w:rPr>
+          <w:rFonts w:ascii="Times New Roman" w:hAnsi="Times New Roman" w:cs="Times New Roman"/>
+          <w:sz w:val="24"/>
+          <w:szCs w:val="24"/>
+          <w:lang w:val="id"/>
+        </w:rPr>
+        <w:t>ditemukan,</w:t>
+      </w:r>
+    </w:p>
+    <w:p>
+      <w:pPr>
+        <w:pStyle w:val="ListParagraph"/>
+        <w:numPr>
+          <w:ilvl w:val="0"/>
+          <w:numId w:val="20"/>
+        </w:numPr>
+        <w:jc w:val="both"/>
+        <w:rPr>
+          <w:rFonts w:ascii="Times New Roman" w:hAnsi="Times New Roman" w:cs="Times New Roman"/>
+          <w:sz w:val="24"/>
+          <w:szCs w:val="24"/>
+          <w:lang w:val="id"/>
+        </w:rPr>
+      </w:pPr>
+      <w:r>
+        <w:rPr>
+          <w:rFonts w:ascii="Times New Roman" w:hAnsi="Times New Roman" w:cs="Times New Roman"/>
+          <w:sz w:val="24"/>
+          <w:szCs w:val="24"/>
+          <w:lang w:val="id"/>
+        </w:rPr>
+        <w:t xml:space="preserve">Jika </w:t>
+      </w:r>
+      <w:r>
+        <w:rPr>
+          <w:rFonts w:ascii="Times New Roman" w:hAnsi="Times New Roman" w:cs="Times New Roman"/>
+          <w:i/>
+          <w:iCs/>
+          <w:sz w:val="24"/>
+          <w:szCs w:val="24"/>
+          <w:lang w:val="id"/>
+        </w:rPr>
+        <w:t>true</w:t>
+      </w:r>
+      <w:r>
+        <w:rPr>
+          <w:rFonts w:ascii="Times New Roman" w:hAnsi="Times New Roman" w:cs="Times New Roman"/>
+          <w:sz w:val="24"/>
+          <w:szCs w:val="24"/>
+          <w:lang w:val="id"/>
+        </w:rPr>
+        <w:t xml:space="preserve"> maka masuk ke pilihan if (array[i] == x),</w:t>
+      </w:r>
+    </w:p>
+    <w:p>
+      <w:pPr>
+        <w:pStyle w:val="ListParagraph"/>
+        <w:numPr>
+          <w:ilvl w:val="0"/>
+          <w:numId w:val="20"/>
+        </w:numPr>
+        <w:jc w:val="both"/>
+        <w:rPr>
+          <w:rFonts w:ascii="Times New Roman" w:hAnsi="Times New Roman" w:cs="Times New Roman"/>
+          <w:sz w:val="24"/>
+          <w:szCs w:val="24"/>
+          <w:lang w:val="id"/>
+        </w:rPr>
+      </w:pPr>
+      <w:r>
+        <w:rPr>
+          <w:rFonts w:ascii="Times New Roman" w:hAnsi="Times New Roman" w:cs="Times New Roman"/>
+          <w:sz w:val="24"/>
+          <w:szCs w:val="24"/>
+          <w:lang w:val="id"/>
+        </w:rPr>
+        <w:t xml:space="preserve">jika </w:t>
+      </w:r>
+      <w:r>
+        <w:rPr>
+          <w:rFonts w:ascii="Times New Roman" w:hAnsi="Times New Roman" w:cs="Times New Roman"/>
+          <w:i/>
+          <w:iCs/>
+          <w:sz w:val="24"/>
+          <w:szCs w:val="24"/>
+          <w:lang w:val="id"/>
+        </w:rPr>
+        <w:t>true</w:t>
+      </w:r>
+      <w:r>
+        <w:rPr>
+          <w:rFonts w:ascii="Times New Roman" w:hAnsi="Times New Roman" w:cs="Times New Roman"/>
+          <w:sz w:val="24"/>
+          <w:szCs w:val="24"/>
+          <w:lang w:val="id"/>
+        </w:rPr>
+        <w:t xml:space="preserve"> maka elemen langsung ditemukan,</w:t>
+      </w:r>
+    </w:p>
+    <w:p>
+      <w:pPr>
+        <w:pStyle w:val="ListParagraph"/>
+        <w:numPr>
+          <w:ilvl w:val="0"/>
+          <w:numId w:val="20"/>
+        </w:numPr>
+        <w:jc w:val="both"/>
+        <w:rPr>
+          <w:rFonts w:ascii="Times New Roman" w:hAnsi="Times New Roman" w:cs="Times New Roman"/>
+          <w:sz w:val="24"/>
+          <w:szCs w:val="24"/>
+          <w:lang w:val="id"/>
+        </w:rPr>
+      </w:pPr>
+      <w:r>
+        <w:rPr>
+          <w:rFonts w:ascii="Times New Roman" w:hAnsi="Times New Roman" w:cs="Times New Roman"/>
+          <w:sz w:val="24"/>
+          <w:szCs w:val="24"/>
+          <w:lang w:val="id"/>
+        </w:rPr>
+        <w:t xml:space="preserve">Jika </w:t>
+      </w:r>
+      <w:r>
+        <w:rPr>
+          <w:rFonts w:ascii="Times New Roman" w:hAnsi="Times New Roman" w:cs="Times New Roman"/>
+          <w:i/>
+          <w:iCs/>
+          <w:sz w:val="24"/>
+          <w:szCs w:val="24"/>
+          <w:lang w:val="id"/>
+        </w:rPr>
+        <w:t>false</w:t>
+      </w:r>
+      <w:r>
+        <w:rPr>
+          <w:rFonts w:ascii="Times New Roman" w:hAnsi="Times New Roman" w:cs="Times New Roman"/>
+          <w:sz w:val="24"/>
+          <w:szCs w:val="24"/>
+          <w:lang w:val="id"/>
+        </w:rPr>
+        <w:t xml:space="preserve"> maka terjadi perulangan i++ (</w:t>
+      </w:r>
+      <w:r>
+        <w:rPr>
+          <w:rFonts w:ascii="Times New Roman" w:hAnsi="Times New Roman" w:cs="Times New Roman"/>
+          <w:i/>
+          <w:iCs/>
+          <w:sz w:val="24"/>
+          <w:szCs w:val="24"/>
+          <w:lang w:val="id"/>
+        </w:rPr>
+        <w:t>increment</w:t>
+      </w:r>
+      <w:r>
+        <w:rPr>
+          <w:rFonts w:ascii="Times New Roman" w:hAnsi="Times New Roman" w:cs="Times New Roman"/>
+          <w:sz w:val="24"/>
+          <w:szCs w:val="24"/>
+          <w:lang w:val="id"/>
+        </w:rPr>
+        <w:t>) dimana i + 1 kemudian di kembalikan ke proses sebelumnya hingga elemen berhasil ditemukan.</w:t>
       </w:r>
     </w:p>
     <w:p>
@@ -18938,7 +19665,7 @@
                                 <w:sz w:val="22"/>
                                 <w:szCs w:val="22"/>
                               </w:rPr>
-                              <w:t>1</w:t>
+                              <w:t>2</w:t>
                             </w:r>
                             <w:r>
                               <w:rPr>
@@ -19056,7 +19783,7 @@
                           <w:sz w:val="22"/>
                           <w:szCs w:val="22"/>
                         </w:rPr>
-                        <w:t>1</w:t>
+                        <w:t>2</w:t>
                       </w:r>
                       <w:r>
                         <w:rPr>
@@ -19119,7 +19846,7 @@
                     <pic:cNvPicPr/>
                   </pic:nvPicPr>
                   <pic:blipFill>
-                    <a:blip r:embed="rId11" cstate="print"/>
+                    <a:blip r:embed="rId18" cstate="print"/>
                     <a:stretch>
                       <a:fillRect/>
                     </a:stretch>
@@ -20567,6 +21294,9 @@
         <w:gridCol w:w="2081"/>
       </w:tblGrid>
       <w:tr>
+        <w:trPr>
+          <w:tblHeader/>
+        </w:trPr>
         <w:tc>
           <w:tcPr>
             <w:tcW w:w="510" w:type="dxa"/>
@@ -22571,21 +23301,6 @@
               <w:pStyle w:val="ListParagraph"/>
               <w:spacing w:line="360" w:lineRule="auto"/>
               <w:ind w:left="0"/>
-              <w:jc w:val="center"/>
-              <w:rPr>
-                <w:rFonts w:ascii="Times New Roman" w:hAnsi="Times New Roman" w:cs="Times New Roman"/>
-                <w:bCs/>
-                <w:sz w:val="24"/>
-                <w:szCs w:val="24"/>
-              </w:rPr>
-            </w:pPr>
-          </w:p>
-          <w:p>
-            <w:pPr>
-              <w:pStyle w:val="ListParagraph"/>
-              <w:spacing w:line="360" w:lineRule="auto"/>
-              <w:ind w:left="0"/>
-              <w:jc w:val="center"/>
               <w:rPr>
                 <w:rFonts w:ascii="Times New Roman" w:hAnsi="Times New Roman" w:cs="Times New Roman"/>
                 <w:bCs/>
@@ -23652,21 +24367,6 @@
               <w:pStyle w:val="ListParagraph"/>
               <w:spacing w:line="360" w:lineRule="auto"/>
               <w:ind w:left="0"/>
-              <w:jc w:val="center"/>
-              <w:rPr>
-                <w:rFonts w:ascii="Times New Roman" w:hAnsi="Times New Roman" w:cs="Times New Roman"/>
-                <w:bCs/>
-                <w:sz w:val="24"/>
-                <w:szCs w:val="24"/>
-              </w:rPr>
-            </w:pPr>
-          </w:p>
-          <w:p>
-            <w:pPr>
-              <w:pStyle w:val="ListParagraph"/>
-              <w:spacing w:line="360" w:lineRule="auto"/>
-              <w:ind w:left="0"/>
-              <w:jc w:val="center"/>
               <w:rPr>
                 <w:rFonts w:ascii="Times New Roman" w:hAnsi="Times New Roman" w:cs="Times New Roman"/>
                 <w:bCs/>
@@ -25065,6 +25765,7 @@
                 <w:sz w:val="24"/>
                 <w:szCs w:val="24"/>
               </w:rPr>
+              <w:lastRenderedPageBreak/>
               <w:t>memiliki</w:t>
             </w:r>
             <w:proofErr w:type="spellEnd"/>
@@ -25155,17 +25856,7 @@
                 <w:sz w:val="24"/>
                 <w:szCs w:val="24"/>
               </w:rPr>
-              <w:t xml:space="preserve"> </w:t>
-            </w:r>
-            <w:r>
-              <w:rPr>
-                <w:rFonts w:ascii="Times New Roman" w:hAnsi="Times New Roman" w:cs="Times New Roman"/>
-                <w:bCs/>
-                <w:sz w:val="24"/>
-                <w:szCs w:val="24"/>
-              </w:rPr>
-              <w:lastRenderedPageBreak/>
-              <w:t xml:space="preserve">Admin, Staff </w:t>
+              <w:t xml:space="preserve"> Admin, Staff </w:t>
             </w:r>
             <w:proofErr w:type="spellStart"/>
             <w:r>
@@ -26172,6 +26863,7 @@
                 <w:sz w:val="24"/>
                 <w:szCs w:val="24"/>
               </w:rPr>
+              <w:lastRenderedPageBreak/>
               <w:t>kesalahan</w:t>
             </w:r>
             <w:proofErr w:type="spellEnd"/>
@@ -26262,7 +26954,6 @@
           <w:sz w:val="24"/>
           <w:szCs w:val="24"/>
         </w:rPr>
-        <w:lastRenderedPageBreak/>
         <w:t>Berikut</w:t>
       </w:r>
       <w:proofErr w:type="spellEnd"/>
@@ -28955,6 +29646,7 @@
           <w:sz w:val="24"/>
           <w:szCs w:val="24"/>
         </w:rPr>
+        <w:lastRenderedPageBreak/>
         <w:t>penelitian</w:t>
       </w:r>
       <w:proofErr w:type="spellEnd"/>
@@ -29129,70 +29821,6 @@
         </w:rPr>
         <w:t>Search.</w:t>
       </w:r>
-    </w:p>
-    <w:p>
-      <w:pPr>
-        <w:pStyle w:val="ListParagraph"/>
-        <w:spacing w:after="0" w:line="360" w:lineRule="auto"/>
-        <w:ind w:left="1080" w:firstLine="360"/>
-        <w:jc w:val="both"/>
-        <w:rPr>
-          <w:rFonts w:ascii="Times New Roman" w:hAnsi="Times New Roman" w:cs="Times New Roman"/>
-          <w:i/>
-          <w:iCs/>
-          <w:sz w:val="24"/>
-          <w:szCs w:val="24"/>
-          <w:lang w:val="id"/>
-        </w:rPr>
-      </w:pPr>
-    </w:p>
-    <w:p>
-      <w:pPr>
-        <w:pStyle w:val="ListParagraph"/>
-        <w:spacing w:after="0" w:line="360" w:lineRule="auto"/>
-        <w:ind w:left="1080" w:firstLine="360"/>
-        <w:jc w:val="both"/>
-        <w:rPr>
-          <w:rFonts w:ascii="Times New Roman" w:hAnsi="Times New Roman" w:cs="Times New Roman"/>
-          <w:i/>
-          <w:iCs/>
-          <w:sz w:val="24"/>
-          <w:szCs w:val="24"/>
-          <w:lang w:val="id"/>
-        </w:rPr>
-      </w:pPr>
-    </w:p>
-    <w:p>
-      <w:pPr>
-        <w:pStyle w:val="ListParagraph"/>
-        <w:spacing w:after="0" w:line="360" w:lineRule="auto"/>
-        <w:ind w:left="1080" w:firstLine="360"/>
-        <w:jc w:val="both"/>
-        <w:rPr>
-          <w:rFonts w:ascii="Times New Roman" w:hAnsi="Times New Roman" w:cs="Times New Roman"/>
-          <w:i/>
-          <w:iCs/>
-          <w:sz w:val="24"/>
-          <w:szCs w:val="24"/>
-          <w:lang w:val="id"/>
-        </w:rPr>
-      </w:pPr>
-    </w:p>
-    <w:p>
-      <w:pPr>
-        <w:pStyle w:val="ListParagraph"/>
-        <w:spacing w:after="0" w:line="360" w:lineRule="auto"/>
-        <w:ind w:left="1080" w:firstLine="360"/>
-        <w:jc w:val="both"/>
-        <w:rPr>
-          <w:rFonts w:ascii="Times New Roman" w:hAnsi="Times New Roman" w:cs="Times New Roman"/>
-          <w:i/>
-          <w:iCs/>
-          <w:sz w:val="24"/>
-          <w:szCs w:val="24"/>
-          <w:lang w:val="id"/>
-        </w:rPr>
-      </w:pPr>
     </w:p>
     <w:p>
       <w:pPr>
@@ -29218,7 +29846,6 @@
           <w:sz w:val="24"/>
           <w:szCs w:val="24"/>
         </w:rPr>
-        <w:lastRenderedPageBreak/>
         <w:t>Jurnal</w:t>
       </w:r>
       <w:proofErr w:type="spellEnd"/>
@@ -32402,6 +33029,7 @@
           <w:sz w:val="24"/>
           <w:szCs w:val="24"/>
         </w:rPr>
+        <w:lastRenderedPageBreak/>
         <w:t>stok</w:t>
       </w:r>
       <w:proofErr w:type="spellEnd"/>
@@ -32635,7 +33263,6 @@
           <w:sz w:val="24"/>
           <w:szCs w:val="24"/>
         </w:rPr>
-        <w:lastRenderedPageBreak/>
         <w:t xml:space="preserve">Dalam </w:t>
       </w:r>
       <w:proofErr w:type="spellStart"/>
@@ -35845,7 +36472,17 @@
           <w:sz w:val="24"/>
           <w:szCs w:val="24"/>
         </w:rPr>
-        <w:t xml:space="preserve">dan pada </w:t>
+        <w:t xml:space="preserve">dan </w:t>
+      </w:r>
+      <w:r>
+        <w:rPr>
+          <w:rFonts w:ascii="Times New Roman" w:hAnsi="Times New Roman" w:cs="Times New Roman"/>
+          <w:bCs/>
+          <w:sz w:val="24"/>
+          <w:szCs w:val="24"/>
+        </w:rPr>
+        <w:lastRenderedPageBreak/>
+        <w:t xml:space="preserve">pada </w:t>
       </w:r>
       <w:proofErr w:type="spellStart"/>
       <w:r>
@@ -36054,7 +36691,6 @@
           <w:sz w:val="24"/>
           <w:szCs w:val="24"/>
         </w:rPr>
-        <w:lastRenderedPageBreak/>
         <w:t>Jurnal</w:t>
       </w:r>
       <w:proofErr w:type="spellEnd"/>
@@ -39216,7 +39852,17 @@
           <w:sz w:val="24"/>
           <w:szCs w:val="24"/>
         </w:rPr>
-        <w:t xml:space="preserve"> Lombok Timur </w:t>
+        <w:t xml:space="preserve"> </w:t>
+      </w:r>
+      <w:r>
+        <w:rPr>
+          <w:rFonts w:ascii="Times New Roman" w:hAnsi="Times New Roman" w:cs="Times New Roman"/>
+          <w:bCs/>
+          <w:sz w:val="24"/>
+          <w:szCs w:val="24"/>
+        </w:rPr>
+        <w:lastRenderedPageBreak/>
+        <w:t xml:space="preserve">Lombok Timur </w:t>
       </w:r>
       <w:proofErr w:type="spellStart"/>
       <w:r>
@@ -39416,19 +40062,7 @@
           <w:sz w:val="24"/>
           <w:szCs w:val="24"/>
         </w:rPr>
-        <w:t xml:space="preserve">Extreme </w:t>
-      </w:r>
-      <w:r>
-        <w:rPr>
-          <w:rFonts w:ascii="Times New Roman" w:hAnsi="Times New Roman" w:cs="Times New Roman"/>
-          <w:bCs/>
-          <w:i/>
-          <w:iCs/>
-          <w:sz w:val="24"/>
-          <w:szCs w:val="24"/>
-        </w:rPr>
-        <w:lastRenderedPageBreak/>
-        <w:t>Programming</w:t>
+        <w:t>Extreme Programming</w:t>
       </w:r>
       <w:r>
         <w:rPr>
@@ -40446,28 +41080,6 @@
         </w:rPr>
         <w:tab/>
       </w:r>
-    </w:p>
-    <w:p>
-      <w:pPr>
-        <w:spacing w:line="360" w:lineRule="auto"/>
-        <w:rPr>
-          <w:rFonts w:ascii="Times New Roman" w:hAnsi="Times New Roman" w:cs="Times New Roman"/>
-          <w:b/>
-          <w:sz w:val="24"/>
-          <w:szCs w:val="24"/>
-        </w:rPr>
-      </w:pPr>
-    </w:p>
-    <w:p>
-      <w:pPr>
-        <w:spacing w:line="360" w:lineRule="auto"/>
-        <w:rPr>
-          <w:rFonts w:ascii="Times New Roman" w:hAnsi="Times New Roman" w:cs="Times New Roman"/>
-          <w:b/>
-          <w:sz w:val="24"/>
-          <w:szCs w:val="24"/>
-        </w:rPr>
-      </w:pPr>
     </w:p>
     <w:p>
       <w:pPr>
@@ -40704,7 +41316,7 @@
                     </pic:cNvPicPr>
                   </pic:nvPicPr>
                   <pic:blipFill>
-                    <a:blip r:embed="rId12">
+                    <a:blip r:embed="rId19">
                       <a:extLst>
                         <a:ext uri="{28A0092B-C50C-407E-A947-70E740481C1C}">
                           <a14:useLocalDpi xmlns:a14="http://schemas.microsoft.com/office/drawing/2010/main" val="0"/>
@@ -53330,8 +53942,8 @@
       </w:r>
     </w:p>
     <w:sectPr>
-      <w:headerReference w:type="first" r:id="rId13"/>
-      <w:footerReference w:type="first" r:id="rId14"/>
+      <w:headerReference w:type="first" r:id="rId20"/>
+      <w:footerReference w:type="first" r:id="rId21"/>
       <w:pgSz w:w="11907" w:h="16840" w:code="9"/>
       <w:pgMar w:top="1701" w:right="1701" w:bottom="1701" w:left="2268" w:header="714" w:footer="0" w:gutter="0"/>
       <w:pgNumType w:start="1"/>
@@ -53368,6 +53980,36 @@
 </file>
 
 <file path=word/footer1.xml><?xml version="1.0" encoding="utf-8"?>
+<w:ftr xmlns:wpc="http://schemas.microsoft.com/office/word/2010/wordprocessingCanvas" xmlns:cx="http://schemas.microsoft.com/office/drawing/2014/chartex" xmlns:cx1="http://schemas.microsoft.com/office/drawing/2015/9/8/chartex" xmlns:cx2="http://schemas.microsoft.com/office/drawing/2015/10/21/chartex" xmlns:cx3="http://schemas.microsoft.com/office/drawing/2016/5/9/chartex" xmlns:cx4="http://schemas.microsoft.com/office/drawing/2016/5/10/chartex" xmlns:cx5="http://schemas.microsoft.com/office/drawing/2016/5/11/chartex" xmlns:cx6="http://schemas.microsoft.com/office/drawing/2016/5/12/chartex" xmlns:cx7="http://schemas.microsoft.com/office/drawing/2016/5/13/chartex" xmlns:cx8="http://schemas.microsoft.com/office/drawing/2016/5/14/chartex" xmlns:mc="http://schemas.openxmlformats.org/markup-compatibility/2006" xmlns:aink="http://schemas.microsoft.com/office/drawing/2016/ink" xmlns:am3d="http://schemas.microsoft.com/office/drawing/2017/model3d" xmlns:o="urn:schemas-microsoft-com:office:office" xmlns:oel="http://schemas.microsoft.com/office/2019/extlst" xmlns:r="http://schemas.openxmlformats.org/officeDocument/2006/relationships" xmlns:m="http://schemas.openxmlformats.org/officeDocument/2006/math" xmlns:v="urn:schemas-microsoft-com:vml" xmlns:wp14="http://schemas.microsoft.com/office/word/2010/wordprocessingDrawing" xmlns:wp="http://schemas.openxmlformats.org/drawingml/2006/wordprocessingDrawing" xmlns:w10="urn:schemas-microsoft-com:office:word" xmlns:w="http://schemas.openxmlformats.org/wordprocessingml/2006/main" xmlns:w14="http://schemas.microsoft.com/office/word/2010/wordml" xmlns:w15="http://schemas.microsoft.com/office/word/2012/wordml" xmlns:w16cex="http://schemas.microsoft.com/office/word/2018/wordml/cex" xmlns:w16cid="http://schemas.microsoft.com/office/word/2016/wordml/cid" xmlns:w16="http://schemas.microsoft.com/office/word/2018/wordml" xmlns:w16du="http://schemas.microsoft.com/office/word/2023/wordml/word16du" xmlns:w16sdtdh="http://schemas.microsoft.com/office/word/2020/wordml/sdtdatahash" xmlns:w16sdtfl="http://schemas.microsoft.com/office/word/2024/wordml/sdtformatlock" xmlns:w16se="http://schemas.microsoft.com/office/word/2015/wordml/symex" xmlns:wpg="http://schemas.microsoft.com/office/word/2010/wordprocessingGroup" xmlns:wpi="http://schemas.microsoft.com/office/word/2010/wordprocessingInk" xmlns:wne="http://schemas.microsoft.com/office/word/2006/wordml" xmlns:wps="http://schemas.microsoft.com/office/word/2010/wordprocessingShape" mc:Ignorable="w14 w15 w16se w16cid w16 w16cex w16sdtdh w16sdtfl w16du wp14">
+  <w:p>
+    <w:pPr>
+      <w:pStyle w:val="Footer"/>
+    </w:pPr>
+  </w:p>
+</w:ftr>
+</file>
+
+<file path=word/footer2.xml><?xml version="1.0" encoding="utf-8"?>
+<w:ftr xmlns:wpc="http://schemas.microsoft.com/office/word/2010/wordprocessingCanvas" xmlns:cx="http://schemas.microsoft.com/office/drawing/2014/chartex" xmlns:cx1="http://schemas.microsoft.com/office/drawing/2015/9/8/chartex" xmlns:cx2="http://schemas.microsoft.com/office/drawing/2015/10/21/chartex" xmlns:cx3="http://schemas.microsoft.com/office/drawing/2016/5/9/chartex" xmlns:cx4="http://schemas.microsoft.com/office/drawing/2016/5/10/chartex" xmlns:cx5="http://schemas.microsoft.com/office/drawing/2016/5/11/chartex" xmlns:cx6="http://schemas.microsoft.com/office/drawing/2016/5/12/chartex" xmlns:cx7="http://schemas.microsoft.com/office/drawing/2016/5/13/chartex" xmlns:cx8="http://schemas.microsoft.com/office/drawing/2016/5/14/chartex" xmlns:mc="http://schemas.openxmlformats.org/markup-compatibility/2006" xmlns:aink="http://schemas.microsoft.com/office/drawing/2016/ink" xmlns:am3d="http://schemas.microsoft.com/office/drawing/2017/model3d" xmlns:o="urn:schemas-microsoft-com:office:office" xmlns:oel="http://schemas.microsoft.com/office/2019/extlst" xmlns:r="http://schemas.openxmlformats.org/officeDocument/2006/relationships" xmlns:m="http://schemas.openxmlformats.org/officeDocument/2006/math" xmlns:v="urn:schemas-microsoft-com:vml" xmlns:wp14="http://schemas.microsoft.com/office/word/2010/wordprocessingDrawing" xmlns:wp="http://schemas.openxmlformats.org/drawingml/2006/wordprocessingDrawing" xmlns:w10="urn:schemas-microsoft-com:office:word" xmlns:w="http://schemas.openxmlformats.org/wordprocessingml/2006/main" xmlns:w14="http://schemas.microsoft.com/office/word/2010/wordml" xmlns:w15="http://schemas.microsoft.com/office/word/2012/wordml" xmlns:w16cex="http://schemas.microsoft.com/office/word/2018/wordml/cex" xmlns:w16cid="http://schemas.microsoft.com/office/word/2016/wordml/cid" xmlns:w16="http://schemas.microsoft.com/office/word/2018/wordml" xmlns:w16du="http://schemas.microsoft.com/office/word/2023/wordml/word16du" xmlns:w16sdtdh="http://schemas.microsoft.com/office/word/2020/wordml/sdtdatahash" xmlns:w16sdtfl="http://schemas.microsoft.com/office/word/2024/wordml/sdtformatlock" xmlns:w16se="http://schemas.microsoft.com/office/word/2015/wordml/symex" xmlns:wpg="http://schemas.microsoft.com/office/word/2010/wordprocessingGroup" xmlns:wpi="http://schemas.microsoft.com/office/word/2010/wordprocessingInk" xmlns:wne="http://schemas.microsoft.com/office/word/2006/wordml" xmlns:wps="http://schemas.microsoft.com/office/word/2010/wordprocessingShape" mc:Ignorable="w14 w15 w16se w16cid w16 w16cex w16sdtdh w16sdtfl w16du wp14">
+  <w:p>
+    <w:pPr>
+      <w:pStyle w:val="Footer"/>
+    </w:pPr>
+  </w:p>
+</w:ftr>
+</file>
+
+<file path=word/footer3.xml><?xml version="1.0" encoding="utf-8"?>
+<w:ftr xmlns:wpc="http://schemas.microsoft.com/office/word/2010/wordprocessingCanvas" xmlns:cx="http://schemas.microsoft.com/office/drawing/2014/chartex" xmlns:cx1="http://schemas.microsoft.com/office/drawing/2015/9/8/chartex" xmlns:cx2="http://schemas.microsoft.com/office/drawing/2015/10/21/chartex" xmlns:cx3="http://schemas.microsoft.com/office/drawing/2016/5/9/chartex" xmlns:cx4="http://schemas.microsoft.com/office/drawing/2016/5/10/chartex" xmlns:cx5="http://schemas.microsoft.com/office/drawing/2016/5/11/chartex" xmlns:cx6="http://schemas.microsoft.com/office/drawing/2016/5/12/chartex" xmlns:cx7="http://schemas.microsoft.com/office/drawing/2016/5/13/chartex" xmlns:cx8="http://schemas.microsoft.com/office/drawing/2016/5/14/chartex" xmlns:mc="http://schemas.openxmlformats.org/markup-compatibility/2006" xmlns:aink="http://schemas.microsoft.com/office/drawing/2016/ink" xmlns:am3d="http://schemas.microsoft.com/office/drawing/2017/model3d" xmlns:o="urn:schemas-microsoft-com:office:office" xmlns:oel="http://schemas.microsoft.com/office/2019/extlst" xmlns:r="http://schemas.openxmlformats.org/officeDocument/2006/relationships" xmlns:m="http://schemas.openxmlformats.org/officeDocument/2006/math" xmlns:v="urn:schemas-microsoft-com:vml" xmlns:wp14="http://schemas.microsoft.com/office/word/2010/wordprocessingDrawing" xmlns:wp="http://schemas.openxmlformats.org/drawingml/2006/wordprocessingDrawing" xmlns:w10="urn:schemas-microsoft-com:office:word" xmlns:w="http://schemas.openxmlformats.org/wordprocessingml/2006/main" xmlns:w14="http://schemas.microsoft.com/office/word/2010/wordml" xmlns:w15="http://schemas.microsoft.com/office/word/2012/wordml" xmlns:w16cex="http://schemas.microsoft.com/office/word/2018/wordml/cex" xmlns:w16cid="http://schemas.microsoft.com/office/word/2016/wordml/cid" xmlns:w16="http://schemas.microsoft.com/office/word/2018/wordml" xmlns:w16du="http://schemas.microsoft.com/office/word/2023/wordml/word16du" xmlns:w16sdtdh="http://schemas.microsoft.com/office/word/2020/wordml/sdtdatahash" xmlns:w16sdtfl="http://schemas.microsoft.com/office/word/2024/wordml/sdtformatlock" xmlns:w16se="http://schemas.microsoft.com/office/word/2015/wordml/symex" xmlns:wpg="http://schemas.microsoft.com/office/word/2010/wordprocessingGroup" xmlns:wpi="http://schemas.microsoft.com/office/word/2010/wordprocessingInk" xmlns:wne="http://schemas.microsoft.com/office/word/2006/wordml" xmlns:wps="http://schemas.microsoft.com/office/word/2010/wordprocessingShape" mc:Ignorable="w14 w15 w16se w16cid w16 w16cex w16sdtdh w16sdtfl w16du wp14">
+  <w:p>
+    <w:pPr>
+      <w:pStyle w:val="Footer"/>
+    </w:pPr>
+  </w:p>
+</w:ftr>
+</file>
+
+<file path=word/footer4.xml><?xml version="1.0" encoding="utf-8"?>
 <w:ftr xmlns:wpc="http://schemas.microsoft.com/office/word/2010/wordprocessingCanvas" xmlns:cx="http://schemas.microsoft.com/office/drawing/2014/chartex" xmlns:cx1="http://schemas.microsoft.com/office/drawing/2015/9/8/chartex" xmlns:cx2="http://schemas.microsoft.com/office/drawing/2015/10/21/chartex" xmlns:cx3="http://schemas.microsoft.com/office/drawing/2016/5/9/chartex" xmlns:cx4="http://schemas.microsoft.com/office/drawing/2016/5/10/chartex" xmlns:cx5="http://schemas.microsoft.com/office/drawing/2016/5/11/chartex" xmlns:cx6="http://schemas.microsoft.com/office/drawing/2016/5/12/chartex" xmlns:cx7="http://schemas.microsoft.com/office/drawing/2016/5/13/chartex" xmlns:cx8="http://schemas.microsoft.com/office/drawing/2016/5/14/chartex" xmlns:mc="http://schemas.openxmlformats.org/markup-compatibility/2006" xmlns:aink="http://schemas.microsoft.com/office/drawing/2016/ink" xmlns:am3d="http://schemas.microsoft.com/office/drawing/2017/model3d" xmlns:o="urn:schemas-microsoft-com:office:office" xmlns:oel="http://schemas.microsoft.com/office/2019/extlst" xmlns:r="http://schemas.openxmlformats.org/officeDocument/2006/relationships" xmlns:m="http://schemas.openxmlformats.org/officeDocument/2006/math" xmlns:v="urn:schemas-microsoft-com:vml" xmlns:wp14="http://schemas.microsoft.com/office/word/2010/wordprocessingDrawing" xmlns:wp="http://schemas.openxmlformats.org/drawingml/2006/wordprocessingDrawing" xmlns:w10="urn:schemas-microsoft-com:office:word" xmlns:w="http://schemas.openxmlformats.org/wordprocessingml/2006/main" xmlns:w14="http://schemas.microsoft.com/office/word/2010/wordml" xmlns:w15="http://schemas.microsoft.com/office/word/2012/wordml" xmlns:w16cex="http://schemas.microsoft.com/office/word/2018/wordml/cex" xmlns:w16cid="http://schemas.microsoft.com/office/word/2016/wordml/cid" xmlns:w16="http://schemas.microsoft.com/office/word/2018/wordml" xmlns:w16du="http://schemas.microsoft.com/office/word/2023/wordml/word16du" xmlns:w16sdtdh="http://schemas.microsoft.com/office/word/2020/wordml/sdtdatahash" xmlns:w16sdtfl="http://schemas.microsoft.com/office/word/2024/wordml/sdtformatlock" xmlns:w16se="http://schemas.microsoft.com/office/word/2015/wordml/symex" xmlns:wpg="http://schemas.microsoft.com/office/word/2010/wordprocessingGroup" xmlns:wpi="http://schemas.microsoft.com/office/word/2010/wordprocessingInk" xmlns:wne="http://schemas.microsoft.com/office/word/2006/wordml" xmlns:wps="http://schemas.microsoft.com/office/word/2010/wordprocessingShape" mc:Ignorable="w14 w15 w16se w16cid w16 w16cex w16sdtdh w16sdtfl w16du wp14">
   <w:sdt>
     <w:sdtPr>
@@ -53420,7 +54062,7 @@
 </w:ftr>
 </file>
 
-<file path=word/footer2.xml><?xml version="1.0" encoding="utf-8"?>
+<file path=word/footer5.xml><?xml version="1.0" encoding="utf-8"?>
 <w:ftr xmlns:wpc="http://schemas.microsoft.com/office/word/2010/wordprocessingCanvas" xmlns:cx="http://schemas.microsoft.com/office/drawing/2014/chartex" xmlns:cx1="http://schemas.microsoft.com/office/drawing/2015/9/8/chartex" xmlns:cx2="http://schemas.microsoft.com/office/drawing/2015/10/21/chartex" xmlns:cx3="http://schemas.microsoft.com/office/drawing/2016/5/9/chartex" xmlns:cx4="http://schemas.microsoft.com/office/drawing/2016/5/10/chartex" xmlns:cx5="http://schemas.microsoft.com/office/drawing/2016/5/11/chartex" xmlns:cx6="http://schemas.microsoft.com/office/drawing/2016/5/12/chartex" xmlns:cx7="http://schemas.microsoft.com/office/drawing/2016/5/13/chartex" xmlns:cx8="http://schemas.microsoft.com/office/drawing/2016/5/14/chartex" xmlns:mc="http://schemas.openxmlformats.org/markup-compatibility/2006" xmlns:aink="http://schemas.microsoft.com/office/drawing/2016/ink" xmlns:am3d="http://schemas.microsoft.com/office/drawing/2017/model3d" xmlns:o="urn:schemas-microsoft-com:office:office" xmlns:oel="http://schemas.microsoft.com/office/2019/extlst" xmlns:r="http://schemas.openxmlformats.org/officeDocument/2006/relationships" xmlns:m="http://schemas.openxmlformats.org/officeDocument/2006/math" xmlns:v="urn:schemas-microsoft-com:vml" xmlns:wp14="http://schemas.microsoft.com/office/word/2010/wordprocessingDrawing" xmlns:wp="http://schemas.openxmlformats.org/drawingml/2006/wordprocessingDrawing" xmlns:w10="urn:schemas-microsoft-com:office:word" xmlns:w="http://schemas.openxmlformats.org/wordprocessingml/2006/main" xmlns:w14="http://schemas.microsoft.com/office/word/2010/wordml" xmlns:w15="http://schemas.microsoft.com/office/word/2012/wordml" xmlns:w16cex="http://schemas.microsoft.com/office/word/2018/wordml/cex" xmlns:w16cid="http://schemas.microsoft.com/office/word/2016/wordml/cid" xmlns:w16="http://schemas.microsoft.com/office/word/2018/wordml" xmlns:w16du="http://schemas.microsoft.com/office/word/2023/wordml/word16du" xmlns:w16sdtdh="http://schemas.microsoft.com/office/word/2020/wordml/sdtdatahash" xmlns:w16sdtfl="http://schemas.microsoft.com/office/word/2024/wordml/sdtformatlock" xmlns:w16se="http://schemas.microsoft.com/office/word/2015/wordml/symex" xmlns:wpg="http://schemas.microsoft.com/office/word/2010/wordprocessingGroup" xmlns:wpi="http://schemas.microsoft.com/office/word/2010/wordprocessingInk" xmlns:wne="http://schemas.microsoft.com/office/word/2006/wordml" xmlns:wps="http://schemas.microsoft.com/office/word/2010/wordprocessingShape" mc:Ignorable="w14 w15 w16se w16cid w16 w16cex w16sdtdh w16sdtfl w16du wp14">
   <w:sdt>
     <w:sdtPr>
@@ -53473,7 +54115,7 @@
 </w:ftr>
 </file>
 
-<file path=word/footer3.xml><?xml version="1.0" encoding="utf-8"?>
+<file path=word/footer6.xml><?xml version="1.0" encoding="utf-8"?>
 <w:ftr xmlns:wpc="http://schemas.microsoft.com/office/word/2010/wordprocessingCanvas" xmlns:cx="http://schemas.microsoft.com/office/drawing/2014/chartex" xmlns:cx1="http://schemas.microsoft.com/office/drawing/2015/9/8/chartex" xmlns:cx2="http://schemas.microsoft.com/office/drawing/2015/10/21/chartex" xmlns:cx3="http://schemas.microsoft.com/office/drawing/2016/5/9/chartex" xmlns:cx4="http://schemas.microsoft.com/office/drawing/2016/5/10/chartex" xmlns:cx5="http://schemas.microsoft.com/office/drawing/2016/5/11/chartex" xmlns:cx6="http://schemas.microsoft.com/office/drawing/2016/5/12/chartex" xmlns:cx7="http://schemas.microsoft.com/office/drawing/2016/5/13/chartex" xmlns:cx8="http://schemas.microsoft.com/office/drawing/2016/5/14/chartex" xmlns:mc="http://schemas.openxmlformats.org/markup-compatibility/2006" xmlns:aink="http://schemas.microsoft.com/office/drawing/2016/ink" xmlns:am3d="http://schemas.microsoft.com/office/drawing/2017/model3d" xmlns:o="urn:schemas-microsoft-com:office:office" xmlns:oel="http://schemas.microsoft.com/office/2019/extlst" xmlns:r="http://schemas.openxmlformats.org/officeDocument/2006/relationships" xmlns:m="http://schemas.openxmlformats.org/officeDocument/2006/math" xmlns:v="urn:schemas-microsoft-com:vml" xmlns:wp14="http://schemas.microsoft.com/office/word/2010/wordprocessingDrawing" xmlns:wp="http://schemas.openxmlformats.org/drawingml/2006/wordprocessingDrawing" xmlns:w10="urn:schemas-microsoft-com:office:word" xmlns:w="http://schemas.openxmlformats.org/wordprocessingml/2006/main" xmlns:w14="http://schemas.microsoft.com/office/word/2010/wordml" xmlns:w15="http://schemas.microsoft.com/office/word/2012/wordml" xmlns:w16cex="http://schemas.microsoft.com/office/word/2018/wordml/cex" xmlns:w16cid="http://schemas.microsoft.com/office/word/2016/wordml/cid" xmlns:w16="http://schemas.microsoft.com/office/word/2018/wordml" xmlns:w16du="http://schemas.microsoft.com/office/word/2023/wordml/word16du" xmlns:w16sdtdh="http://schemas.microsoft.com/office/word/2020/wordml/sdtdatahash" xmlns:w16sdtfl="http://schemas.microsoft.com/office/word/2024/wordml/sdtformatlock" xmlns:w16se="http://schemas.microsoft.com/office/word/2015/wordml/symex" xmlns:wpg="http://schemas.microsoft.com/office/word/2010/wordprocessingGroup" xmlns:wpi="http://schemas.microsoft.com/office/word/2010/wordprocessingInk" xmlns:wne="http://schemas.microsoft.com/office/word/2006/wordml" xmlns:wps="http://schemas.microsoft.com/office/word/2010/wordprocessingShape" mc:Ignorable="w14 w15 w16se w16cid w16 w16cex w16sdtdh w16sdtfl w16du wp14">
   <w:p>
     <w:pPr>
@@ -53509,6 +54151,36 @@
 </file>
 
 <file path=word/header1.xml><?xml version="1.0" encoding="utf-8"?>
+<w:hdr xmlns:wpc="http://schemas.microsoft.com/office/word/2010/wordprocessingCanvas" xmlns:cx="http://schemas.microsoft.com/office/drawing/2014/chartex" xmlns:cx1="http://schemas.microsoft.com/office/drawing/2015/9/8/chartex" xmlns:cx2="http://schemas.microsoft.com/office/drawing/2015/10/21/chartex" xmlns:cx3="http://schemas.microsoft.com/office/drawing/2016/5/9/chartex" xmlns:cx4="http://schemas.microsoft.com/office/drawing/2016/5/10/chartex" xmlns:cx5="http://schemas.microsoft.com/office/drawing/2016/5/11/chartex" xmlns:cx6="http://schemas.microsoft.com/office/drawing/2016/5/12/chartex" xmlns:cx7="http://schemas.microsoft.com/office/drawing/2016/5/13/chartex" xmlns:cx8="http://schemas.microsoft.com/office/drawing/2016/5/14/chartex" xmlns:mc="http://schemas.openxmlformats.org/markup-compatibility/2006" xmlns:aink="http://schemas.microsoft.com/office/drawing/2016/ink" xmlns:am3d="http://schemas.microsoft.com/office/drawing/2017/model3d" xmlns:o="urn:schemas-microsoft-com:office:office" xmlns:oel="http://schemas.microsoft.com/office/2019/extlst" xmlns:r="http://schemas.openxmlformats.org/officeDocument/2006/relationships" xmlns:m="http://schemas.openxmlformats.org/officeDocument/2006/math" xmlns:v="urn:schemas-microsoft-com:vml" xmlns:wp14="http://schemas.microsoft.com/office/word/2010/wordprocessingDrawing" xmlns:wp="http://schemas.openxmlformats.org/drawingml/2006/wordprocessingDrawing" xmlns:w10="urn:schemas-microsoft-com:office:word" xmlns:w="http://schemas.openxmlformats.org/wordprocessingml/2006/main" xmlns:w14="http://schemas.microsoft.com/office/word/2010/wordml" xmlns:w15="http://schemas.microsoft.com/office/word/2012/wordml" xmlns:w16cex="http://schemas.microsoft.com/office/word/2018/wordml/cex" xmlns:w16cid="http://schemas.microsoft.com/office/word/2016/wordml/cid" xmlns:w16="http://schemas.microsoft.com/office/word/2018/wordml" xmlns:w16du="http://schemas.microsoft.com/office/word/2023/wordml/word16du" xmlns:w16sdtdh="http://schemas.microsoft.com/office/word/2020/wordml/sdtdatahash" xmlns:w16sdtfl="http://schemas.microsoft.com/office/word/2024/wordml/sdtformatlock" xmlns:w16se="http://schemas.microsoft.com/office/word/2015/wordml/symex" xmlns:wpg="http://schemas.microsoft.com/office/word/2010/wordprocessingGroup" xmlns:wpi="http://schemas.microsoft.com/office/word/2010/wordprocessingInk" xmlns:wne="http://schemas.microsoft.com/office/word/2006/wordml" xmlns:wps="http://schemas.microsoft.com/office/word/2010/wordprocessingShape" mc:Ignorable="w14 w15 w16se w16cid w16 w16cex w16sdtdh w16sdtfl w16du wp14">
+  <w:p>
+    <w:pPr>
+      <w:pStyle w:val="Header"/>
+    </w:pPr>
+  </w:p>
+</w:hdr>
+</file>
+
+<file path=word/header2.xml><?xml version="1.0" encoding="utf-8"?>
+<w:hdr xmlns:wpc="http://schemas.microsoft.com/office/word/2010/wordprocessingCanvas" xmlns:cx="http://schemas.microsoft.com/office/drawing/2014/chartex" xmlns:cx1="http://schemas.microsoft.com/office/drawing/2015/9/8/chartex" xmlns:cx2="http://schemas.microsoft.com/office/drawing/2015/10/21/chartex" xmlns:cx3="http://schemas.microsoft.com/office/drawing/2016/5/9/chartex" xmlns:cx4="http://schemas.microsoft.com/office/drawing/2016/5/10/chartex" xmlns:cx5="http://schemas.microsoft.com/office/drawing/2016/5/11/chartex" xmlns:cx6="http://schemas.microsoft.com/office/drawing/2016/5/12/chartex" xmlns:cx7="http://schemas.microsoft.com/office/drawing/2016/5/13/chartex" xmlns:cx8="http://schemas.microsoft.com/office/drawing/2016/5/14/chartex" xmlns:mc="http://schemas.openxmlformats.org/markup-compatibility/2006" xmlns:aink="http://schemas.microsoft.com/office/drawing/2016/ink" xmlns:am3d="http://schemas.microsoft.com/office/drawing/2017/model3d" xmlns:o="urn:schemas-microsoft-com:office:office" xmlns:oel="http://schemas.microsoft.com/office/2019/extlst" xmlns:r="http://schemas.openxmlformats.org/officeDocument/2006/relationships" xmlns:m="http://schemas.openxmlformats.org/officeDocument/2006/math" xmlns:v="urn:schemas-microsoft-com:vml" xmlns:wp14="http://schemas.microsoft.com/office/word/2010/wordprocessingDrawing" xmlns:wp="http://schemas.openxmlformats.org/drawingml/2006/wordprocessingDrawing" xmlns:w10="urn:schemas-microsoft-com:office:word" xmlns:w="http://schemas.openxmlformats.org/wordprocessingml/2006/main" xmlns:w14="http://schemas.microsoft.com/office/word/2010/wordml" xmlns:w15="http://schemas.microsoft.com/office/word/2012/wordml" xmlns:w16cex="http://schemas.microsoft.com/office/word/2018/wordml/cex" xmlns:w16cid="http://schemas.microsoft.com/office/word/2016/wordml/cid" xmlns:w16="http://schemas.microsoft.com/office/word/2018/wordml" xmlns:w16du="http://schemas.microsoft.com/office/word/2023/wordml/word16du" xmlns:w16sdtdh="http://schemas.microsoft.com/office/word/2020/wordml/sdtdatahash" xmlns:w16sdtfl="http://schemas.microsoft.com/office/word/2024/wordml/sdtformatlock" xmlns:w16se="http://schemas.microsoft.com/office/word/2015/wordml/symex" xmlns:wpg="http://schemas.microsoft.com/office/word/2010/wordprocessingGroup" xmlns:wpi="http://schemas.microsoft.com/office/word/2010/wordprocessingInk" xmlns:wne="http://schemas.microsoft.com/office/word/2006/wordml" xmlns:wps="http://schemas.microsoft.com/office/word/2010/wordprocessingShape" mc:Ignorable="w14 w15 w16se w16cid w16 w16cex w16sdtdh w16sdtfl w16du wp14">
+  <w:p>
+    <w:pPr>
+      <w:pStyle w:val="Header"/>
+    </w:pPr>
+  </w:p>
+</w:hdr>
+</file>
+
+<file path=word/header3.xml><?xml version="1.0" encoding="utf-8"?>
+<w:hdr xmlns:wpc="http://schemas.microsoft.com/office/word/2010/wordprocessingCanvas" xmlns:cx="http://schemas.microsoft.com/office/drawing/2014/chartex" xmlns:cx1="http://schemas.microsoft.com/office/drawing/2015/9/8/chartex" xmlns:cx2="http://schemas.microsoft.com/office/drawing/2015/10/21/chartex" xmlns:cx3="http://schemas.microsoft.com/office/drawing/2016/5/9/chartex" xmlns:cx4="http://schemas.microsoft.com/office/drawing/2016/5/10/chartex" xmlns:cx5="http://schemas.microsoft.com/office/drawing/2016/5/11/chartex" xmlns:cx6="http://schemas.microsoft.com/office/drawing/2016/5/12/chartex" xmlns:cx7="http://schemas.microsoft.com/office/drawing/2016/5/13/chartex" xmlns:cx8="http://schemas.microsoft.com/office/drawing/2016/5/14/chartex" xmlns:mc="http://schemas.openxmlformats.org/markup-compatibility/2006" xmlns:aink="http://schemas.microsoft.com/office/drawing/2016/ink" xmlns:am3d="http://schemas.microsoft.com/office/drawing/2017/model3d" xmlns:o="urn:schemas-microsoft-com:office:office" xmlns:oel="http://schemas.microsoft.com/office/2019/extlst" xmlns:r="http://schemas.openxmlformats.org/officeDocument/2006/relationships" xmlns:m="http://schemas.openxmlformats.org/officeDocument/2006/math" xmlns:v="urn:schemas-microsoft-com:vml" xmlns:wp14="http://schemas.microsoft.com/office/word/2010/wordprocessingDrawing" xmlns:wp="http://schemas.openxmlformats.org/drawingml/2006/wordprocessingDrawing" xmlns:w10="urn:schemas-microsoft-com:office:word" xmlns:w="http://schemas.openxmlformats.org/wordprocessingml/2006/main" xmlns:w14="http://schemas.microsoft.com/office/word/2010/wordml" xmlns:w15="http://schemas.microsoft.com/office/word/2012/wordml" xmlns:w16cex="http://schemas.microsoft.com/office/word/2018/wordml/cex" xmlns:w16cid="http://schemas.microsoft.com/office/word/2016/wordml/cid" xmlns:w16="http://schemas.microsoft.com/office/word/2018/wordml" xmlns:w16du="http://schemas.microsoft.com/office/word/2023/wordml/word16du" xmlns:w16sdtdh="http://schemas.microsoft.com/office/word/2020/wordml/sdtdatahash" xmlns:w16sdtfl="http://schemas.microsoft.com/office/word/2024/wordml/sdtformatlock" xmlns:w16se="http://schemas.microsoft.com/office/word/2015/wordml/symex" xmlns:wpg="http://schemas.microsoft.com/office/word/2010/wordprocessingGroup" xmlns:wpi="http://schemas.microsoft.com/office/word/2010/wordprocessingInk" xmlns:wne="http://schemas.microsoft.com/office/word/2006/wordml" xmlns:wps="http://schemas.microsoft.com/office/word/2010/wordprocessingShape" mc:Ignorable="w14 w15 w16se w16cid w16 w16cex w16sdtdh w16sdtfl w16du wp14">
+  <w:p>
+    <w:pPr>
+      <w:pStyle w:val="Header"/>
+    </w:pPr>
+  </w:p>
+</w:hdr>
+</file>
+
+<file path=word/header4.xml><?xml version="1.0" encoding="utf-8"?>
 <w:hdr xmlns:wpc="http://schemas.microsoft.com/office/word/2010/wordprocessingCanvas" xmlns:cx="http://schemas.microsoft.com/office/drawing/2014/chartex" xmlns:cx1="http://schemas.microsoft.com/office/drawing/2015/9/8/chartex" xmlns:cx2="http://schemas.microsoft.com/office/drawing/2015/10/21/chartex" xmlns:cx3="http://schemas.microsoft.com/office/drawing/2016/5/9/chartex" xmlns:cx4="http://schemas.microsoft.com/office/drawing/2016/5/10/chartex" xmlns:cx5="http://schemas.microsoft.com/office/drawing/2016/5/11/chartex" xmlns:cx6="http://schemas.microsoft.com/office/drawing/2016/5/12/chartex" xmlns:cx7="http://schemas.microsoft.com/office/drawing/2016/5/13/chartex" xmlns:cx8="http://schemas.microsoft.com/office/drawing/2016/5/14/chartex" xmlns:mc="http://schemas.openxmlformats.org/markup-compatibility/2006" xmlns:aink="http://schemas.microsoft.com/office/drawing/2016/ink" xmlns:am3d="http://schemas.microsoft.com/office/drawing/2017/model3d" xmlns:o="urn:schemas-microsoft-com:office:office" xmlns:oel="http://schemas.microsoft.com/office/2019/extlst" xmlns:r="http://schemas.openxmlformats.org/officeDocument/2006/relationships" xmlns:m="http://schemas.openxmlformats.org/officeDocument/2006/math" xmlns:v="urn:schemas-microsoft-com:vml" xmlns:wp14="http://schemas.microsoft.com/office/word/2010/wordprocessingDrawing" xmlns:wp="http://schemas.openxmlformats.org/drawingml/2006/wordprocessingDrawing" xmlns:w10="urn:schemas-microsoft-com:office:word" xmlns:w="http://schemas.openxmlformats.org/wordprocessingml/2006/main" xmlns:w14="http://schemas.microsoft.com/office/word/2010/wordml" xmlns:w15="http://schemas.microsoft.com/office/word/2012/wordml" xmlns:w16cex="http://schemas.microsoft.com/office/word/2018/wordml/cex" xmlns:w16cid="http://schemas.microsoft.com/office/word/2016/wordml/cid" xmlns:w16="http://schemas.microsoft.com/office/word/2018/wordml" xmlns:w16du="http://schemas.microsoft.com/office/word/2023/wordml/word16du" xmlns:w16sdtdh="http://schemas.microsoft.com/office/word/2020/wordml/sdtdatahash" xmlns:w16sdtfl="http://schemas.microsoft.com/office/word/2024/wordml/sdtformatlock" xmlns:w16se="http://schemas.microsoft.com/office/word/2015/wordml/symex" xmlns:wpg="http://schemas.microsoft.com/office/word/2010/wordprocessingGroup" xmlns:wpi="http://schemas.microsoft.com/office/word/2010/wordprocessingInk" xmlns:wne="http://schemas.microsoft.com/office/word/2006/wordml" xmlns:wps="http://schemas.microsoft.com/office/word/2010/wordprocessingShape" mc:Ignorable="w14 w15 w16se w16cid w16 w16cex w16sdtdh w16sdtfl w16du wp14">
   <w:p>
     <w:pPr>
@@ -55126,6 +55798,92 @@
     </w:lvl>
   </w:abstractNum>
   <w:abstractNum w:abstractNumId="18" w15:restartNumberingAfterBreak="0">
+    <w:nsid w:val="77165F3E"/>
+    <w:multiLevelType w:val="hybridMultilevel"/>
+    <w:tmpl w:val="41CA4198"/>
+    <w:lvl w:ilvl="0" w:tplc="38090011">
+      <w:start w:val="1"/>
+      <w:numFmt w:val="decimal"/>
+      <w:lvlText w:val="%1)"/>
+      <w:lvlJc w:val="left"/>
+      <w:pPr>
+        <w:ind w:left="1429" w:hanging="360"/>
+      </w:pPr>
+    </w:lvl>
+    <w:lvl w:ilvl="1" w:tplc="38090019" w:tentative="1">
+      <w:start w:val="1"/>
+      <w:numFmt w:val="lowerLetter"/>
+      <w:lvlText w:val="%2."/>
+      <w:lvlJc w:val="left"/>
+      <w:pPr>
+        <w:ind w:left="2149" w:hanging="360"/>
+      </w:pPr>
+    </w:lvl>
+    <w:lvl w:ilvl="2" w:tplc="3809001B" w:tentative="1">
+      <w:start w:val="1"/>
+      <w:numFmt w:val="lowerRoman"/>
+      <w:lvlText w:val="%3."/>
+      <w:lvlJc w:val="right"/>
+      <w:pPr>
+        <w:ind w:left="2869" w:hanging="180"/>
+      </w:pPr>
+    </w:lvl>
+    <w:lvl w:ilvl="3" w:tplc="3809000F" w:tentative="1">
+      <w:start w:val="1"/>
+      <w:numFmt w:val="decimal"/>
+      <w:lvlText w:val="%4."/>
+      <w:lvlJc w:val="left"/>
+      <w:pPr>
+        <w:ind w:left="3589" w:hanging="360"/>
+      </w:pPr>
+    </w:lvl>
+    <w:lvl w:ilvl="4" w:tplc="38090019" w:tentative="1">
+      <w:start w:val="1"/>
+      <w:numFmt w:val="lowerLetter"/>
+      <w:lvlText w:val="%5."/>
+      <w:lvlJc w:val="left"/>
+      <w:pPr>
+        <w:ind w:left="4309" w:hanging="360"/>
+      </w:pPr>
+    </w:lvl>
+    <w:lvl w:ilvl="5" w:tplc="3809001B" w:tentative="1">
+      <w:start w:val="1"/>
+      <w:numFmt w:val="lowerRoman"/>
+      <w:lvlText w:val="%6."/>
+      <w:lvlJc w:val="right"/>
+      <w:pPr>
+        <w:ind w:left="5029" w:hanging="180"/>
+      </w:pPr>
+    </w:lvl>
+    <w:lvl w:ilvl="6" w:tplc="3809000F" w:tentative="1">
+      <w:start w:val="1"/>
+      <w:numFmt w:val="decimal"/>
+      <w:lvlText w:val="%7."/>
+      <w:lvlJc w:val="left"/>
+      <w:pPr>
+        <w:ind w:left="5749" w:hanging="360"/>
+      </w:pPr>
+    </w:lvl>
+    <w:lvl w:ilvl="7" w:tplc="38090019" w:tentative="1">
+      <w:start w:val="1"/>
+      <w:numFmt w:val="lowerLetter"/>
+      <w:lvlText w:val="%8."/>
+      <w:lvlJc w:val="left"/>
+      <w:pPr>
+        <w:ind w:left="6469" w:hanging="360"/>
+      </w:pPr>
+    </w:lvl>
+    <w:lvl w:ilvl="8" w:tplc="3809001B" w:tentative="1">
+      <w:start w:val="1"/>
+      <w:numFmt w:val="lowerRoman"/>
+      <w:lvlText w:val="%9."/>
+      <w:lvlJc w:val="right"/>
+      <w:pPr>
+        <w:ind w:left="7189" w:hanging="180"/>
+      </w:pPr>
+    </w:lvl>
+  </w:abstractNum>
+  <w:abstractNum w:abstractNumId="19" w15:restartNumberingAfterBreak="0">
     <w:nsid w:val="79B60A2F"/>
     <w:multiLevelType w:val="hybridMultilevel"/>
     <w:tmpl w:val="0706AEA8"/>
@@ -55252,7 +56010,7 @@
     <w:abstractNumId w:val="14"/>
   </w:num>
   <w:num w:numId="13" w16cid:durableId="1323773580">
-    <w:abstractNumId w:val="18"/>
+    <w:abstractNumId w:val="19"/>
   </w:num>
   <w:num w:numId="14" w16cid:durableId="1111824888">
     <w:abstractNumId w:val="1"/>
@@ -55271,6 +56029,9 @@
   </w:num>
   <w:num w:numId="19" w16cid:durableId="497885699">
     <w:abstractNumId w:val="0"/>
+  </w:num>
+  <w:num w:numId="20" w16cid:durableId="1880624738">
+    <w:abstractNumId w:val="18"/>
   </w:num>
 </w:numbering>
 </file>

</xml_diff>